<commit_message>
Update achievement report template
</commit_message>
<xml_diff>
--- a/assets/成果書模板_已標記.docx
+++ b/assets/成果書模板_已標記.docx
@@ -68,14 +68,14 @@
       </w:r>
       <w:r>
         <w:rPr>
-          <w:rFonts w:ascii="標楷體" w:eastAsia="標楷體" w:hAnsi="標楷體" w:cs="標楷體"/>
+          <w:rFonts w:ascii="標楷體" w:eastAsia="標楷體" w:hAnsi="標楷體" w:cs="標楷體" w:hint="eastAsia"/>
           <w:b/>
           <w:bCs/>
           <w:sz w:val="32"/>
           <w:szCs w:val="32"/>
           <w:u w:val="single"/>
         </w:rPr>
-        <w:t>一</w:t>
+        <w:t>二</w:t>
       </w:r>
       <w:r>
         <w:rPr>
@@ -1189,10 +1189,7 @@
               </w:rPr>
             </w:pPr>
             <w:r>
-              <w:t>{</w:t>
-            </w:r>
-            <w:r>
-              <w:t>{</w:t>
+              <w:t>{{</w:t>
             </w:r>
             <w:r>
               <w:rPr>
@@ -1207,7 +1204,7 @@
               <w:t>1</w:t>
             </w:r>
             <w:r>
-              <w:t xml:space="preserve"> }}</w:t>
+              <w:t>}}</w:t>
             </w:r>
           </w:p>
         </w:tc>
@@ -1266,10 +1263,7 @@
               </w:rPr>
             </w:pPr>
             <w:r>
-              <w:t>{</w:t>
-            </w:r>
-            <w:r>
-              <w:t>{</w:t>
+              <w:t>{{</w:t>
             </w:r>
             <w:r>
               <w:rPr>
@@ -1284,7 +1278,7 @@
               <w:t>2</w:t>
             </w:r>
             <w:r>
-              <w:t xml:space="preserve"> }}</w:t>
+              <w:t>}}</w:t>
             </w:r>
           </w:p>
         </w:tc>
@@ -1376,10 +1370,7 @@
               </w:rPr>
             </w:pPr>
             <w:r>
-              <w:t>{</w:t>
-            </w:r>
-            <w:r>
-              <w:t>{</w:t>
+              <w:t>{{</w:t>
             </w:r>
             <w:r>
               <w:rPr>
@@ -1394,7 +1385,7 @@
               <w:t>3</w:t>
             </w:r>
             <w:r>
-              <w:t xml:space="preserve"> }}</w:t>
+              <w:t>}}</w:t>
             </w:r>
           </w:p>
         </w:tc>
@@ -1440,10 +1431,7 @@
               </w:rPr>
             </w:pPr>
             <w:r>
-              <w:t>{</w:t>
-            </w:r>
-            <w:r>
-              <w:t>{</w:t>
+              <w:t>{{</w:t>
             </w:r>
             <w:r>
               <w:rPr>
@@ -1452,7 +1440,7 @@
               <w:t>大合照</w:t>
             </w:r>
             <w:r>
-              <w:t xml:space="preserve"> }}</w:t>
+              <w:t>}}</w:t>
             </w:r>
           </w:p>
         </w:tc>
@@ -2121,56 +2109,7 @@
         </w:tc>
       </w:tr>
     </w:tbl>
-    <w:p>
-      <w:pPr>
-        <w:widowControl/>
-        <w:rPr>
-          <w:rFonts w:ascii="標楷體" w:eastAsia="標楷體" w:hAnsi="標楷體" w:cs="標楷體"/>
-        </w:rPr>
-      </w:pPr>
-    </w:p>
-    <w:p>
-      <w:r>
-        <w:br w:type="page"/>
-      </w:r>
-    </w:p>
-    <w:p>
-      <w:pPr>
-        <w:pStyle w:val="1"/>
-      </w:pPr>
-      <w:r>
-        <w:lastRenderedPageBreak/>
-        <w:t>自動簽名區</w:t>
-      </w:r>
-    </w:p>
-    <w:p>
-      <w:r>
-        <w:t>社團負責人簽名：</w:t>
-      </w:r>
-      <w:r>
-        <w:t>{{</w:t>
-      </w:r>
-      <w:r>
-        <w:t>社長簽名</w:t>
-      </w:r>
-      <w:r>
-        <w:t>}}</w:t>
-      </w:r>
-    </w:p>
-    <w:p>
-      <w:r>
-        <w:t>指導老師簽名：</w:t>
-      </w:r>
-      <w:r>
-        <w:t>{{</w:t>
-      </w:r>
-      <w:r>
-        <w:t>老師簽名</w:t>
-      </w:r>
-      <w:r>
-        <w:t>}}</w:t>
-      </w:r>
-    </w:p>
+    <w:p/>
     <w:sectPr>
       <w:headerReference w:type="default" r:id="rId10"/>
       <w:footerReference w:type="default" r:id="rId11"/>

</xml_diff>

<commit_message>
Fix overview and review fields
</commit_message>
<xml_diff>
--- a/assets/成果書模板_已標記.docx
+++ b/assets/成果書模板_已標記.docx
@@ -808,33 +808,20 @@
             <w:pPr>
               <w:spacing w:line="360" w:lineRule="auto"/>
               <w:rPr>
-                <w:rFonts w:ascii="標楷體" w:eastAsia="標楷體" w:hAnsi="標楷體" w:cs="標楷體"/>
-                <w:sz w:val="22"/>
-                <w:szCs w:val="22"/>
-              </w:rPr>
-            </w:pPr>
-            <w:r>
-              <w:rPr>
-                <w:rFonts w:ascii="標楷體" w:eastAsia="標楷體" w:hAnsi="標楷體" w:cs="標楷體"/>
-                <w:highlight w:val="white"/>
-              </w:rPr>
-              <w:t>以茶香結合茶點，透過臺灣茶旅行，讓本校學生更認識茶道社，進而加入茶道社</w:t>
-            </w:r>
-            <w:proofErr w:type="gramStart"/>
-            <w:r>
-              <w:rPr>
-                <w:rFonts w:ascii="標楷體" w:eastAsia="標楷體" w:hAnsi="標楷體" w:cs="標楷體"/>
-                <w:highlight w:val="white"/>
-              </w:rPr>
-              <w:t>社</w:t>
-            </w:r>
-            <w:proofErr w:type="gramEnd"/>
-            <w:r>
-              <w:rPr>
-                <w:rFonts w:ascii="標楷體" w:eastAsia="標楷體" w:hAnsi="標楷體" w:cs="標楷體"/>
-                <w:highlight w:val="white"/>
-              </w:rPr>
-              <w:t>課活動。</w:t>
+                <w:lang w:val="en-US"/>
+              </w:rPr>
+            </w:pPr>
+            <w:r>
+              <w:t>{{</w:t>
+            </w:r>
+            <w:r>
+              <w:rPr>
+                <w:lang w:val="en-US"/>
+              </w:rPr>
+              <w:t>活動內容概述</w:t>
+            </w:r>
+            <w:r>
+              <w:t>}}</w:t>
             </w:r>
           </w:p>
         </w:tc>
@@ -3144,7 +3131,6 @@
   <w:style w:type="character" w:default="1" w:styleId="a0">
     <w:name w:val="Default Paragraph Font"/>
     <w:uiPriority w:val="1"/>
-    <w:semiHidden/>
     <w:unhideWhenUsed/>
   </w:style>
   <w:style w:type="table" w:default="1" w:styleId="a1">

</xml_diff>